<commit_message>
docs: use curly quotes instead of corner brackets in the annex
「」 is a Japanese convention; mainland Chinese typography uses “”. Replaced all
21 pairs. Verified in the exported PDF: no corner brackets remain.

Co-Authored-By: Claude Opus 5 <noreply@anthropic.com>
</commit_message>
<xml_diff>
--- a/deliverables/CampusOne_补充材料.docx
+++ b/deliverables/CampusOne_补充材料.docx
@@ -904,7 +904,7 @@
           <w:color w:val="333E4C"/>
           <w:sz w:val="20"/>
         </w:rPr>
-        <w:t>在「申请办理」页，把「预计人数」改成 800（该场地核定容量 120 人）</w:t>
+        <w:t>在“申请办理”页，把“预计人数”改成 800（该场地核定容量 120 人）</w:t>
       </w:r>
     </w:p>
     <w:p>
@@ -928,7 +928,7 @@
           <w:color w:val="1B2430"/>
           <w:sz w:val="19"/>
         </w:rPr>
-        <w:t>右侧「预计人数」由「容量可用」变为「需调整」</w:t>
+        <w:t>右侧“预计人数”由“容量可用”变为“需调整”</w:t>
       </w:r>
     </w:p>
     <w:p>
@@ -953,7 +953,7 @@
           <w:color w:val="333E4C"/>
           <w:sz w:val="20"/>
         </w:rPr>
-        <w:t>点击「规则预检」</w:t>
+        <w:t>点击“规则预检”</w:t>
       </w:r>
     </w:p>
     <w:p>
@@ -977,7 +977,7 @@
           <w:color w:val="1B2430"/>
           <w:sz w:val="19"/>
         </w:rPr>
-        <w:t>六条规则逐条给出判定，VENUE-CAP-001 标红，写明「预计 800 人，超过场地容量 120 人」</w:t>
+        <w:t>六条规则逐条给出判定，VENUE-CAP-001 标红，写明“预计 800 人，超过场地容量 120 人”</w:t>
       </w:r>
     </w:p>
     <w:p>
@@ -1002,7 +1002,7 @@
           <w:color w:val="333E4C"/>
           <w:sz w:val="20"/>
         </w:rPr>
-        <w:t>点击「让 AI 帮我整理」</w:t>
+        <w:t>点击“让 AI 帮我整理”</w:t>
       </w:r>
     </w:p>
     <w:p>
@@ -1027,7 +1027,7 @@
           <w:color w:val="1B2430"/>
           <w:sz w:val="19"/>
         </w:rPr>
-        <w:t>AI 文字上方先出现「规则预检未通过 · 1 项」，并注明「以上结论由规则引擎判定，不由模型给出」</w:t>
+        <w:t>AI 文字上方先出现“规则预检未通过 · 1 项”，并注明“以上结论由规则引擎判定，不由模型给出”</w:t>
       </w:r>
     </w:p>
     <w:tbl>
@@ -1120,7 +1120,7 @@
           <w:color w:val="333E4C"/>
           <w:sz w:val="20"/>
         </w:rPr>
-        <w:t>在右侧「演示模型异常」中选择「虚构规则」</w:t>
+        <w:t>在右侧“演示模型异常”中选择“虚构规则”</w:t>
       </w:r>
     </w:p>
     <w:p>
@@ -1169,7 +1169,7 @@
           <w:color w:val="333E4C"/>
           <w:sz w:val="20"/>
         </w:rPr>
-        <w:t>点击「运行表单整理」</w:t>
+        <w:t>点击“运行表单整理”</w:t>
       </w:r>
     </w:p>
     <w:p>
@@ -1193,7 +1193,7 @@
           <w:color w:val="1B2430"/>
           <w:sz w:val="19"/>
         </w:rPr>
-        <w:t>AI 面板显示「输出已拒绝」，错误码 RULE_NOT_FOUND</w:t>
+        <w:t>AI 面板显示“输出已拒绝”，错误码 RULE_NOT_FOUND</w:t>
       </w:r>
     </w:p>
     <w:p>
@@ -1218,7 +1218,7 @@
           <w:color w:val="333E4C"/>
           <w:sz w:val="20"/>
         </w:rPr>
-        <w:t>打开左侧「AI 运行证据」</w:t>
+        <w:t>打开左侧“AI 运行证据”</w:t>
       </w:r>
     </w:p>
     <w:p>
@@ -1242,7 +1242,7 @@
           <w:color w:val="1B2430"/>
           <w:sz w:val="19"/>
         </w:rPr>
-        <w:t>该次运行记为「已拒绝」，保留任务、模型、耗时与错误码</w:t>
+        <w:t>该次运行记为“已拒绝”，保留任务、模型、耗时与错误码</w:t>
       </w:r>
     </w:p>
     <w:p>
@@ -2419,7 +2419,7 @@
           <w:color w:val="1B2430"/>
           <w:sz w:val="19"/>
         </w:rPr>
-        <w:t>已退回的案件，通知草稿中不得出现「等待审批」「无需修改」这类与状态矛盾的表述</w:t>
+        <w:t>已退回的案件，通知草稿中不得出现“等待审批”“无需修改”这类与状态矛盾的表述</w:t>
       </w:r>
     </w:p>
     <w:tbl>
@@ -4077,7 +4077,7 @@
           <w:color w:val="1B2430"/>
           <w:sz w:val="21"/>
         </w:rPr>
-        <w:t>缺陷二　退回通知写成了「已提交、等待审批」</w:t>
+        <w:t>缺陷二　退回通知写成了“已提交、等待审批”</w:t>
       </w:r>
     </w:p>
     <w:p>
@@ -4234,7 +4234,7 @@
                 <w:color w:val="1B2430"/>
                 <w:sz w:val="19"/>
               </w:rPr>
-              <w:t>您好，您提交的「2026 秋季社团招新宣讲会」场地申请已收到。经初步核对，预计参加人数为 80 人，已接近场地容量上限（120 人）。为保障活动安全有序进行，请您补充现场秩序维护与疏散安排的具体说明，并重新提交申请。</w:t>
+              <w:t>您好，您提交的“2026 秋季社团招新宣讲会”场地申请已收到。经初步核对，预计参加人数为 80 人，已接近场地容量上限（120 人）。为保障活动安全有序进行，请您补充现场秩序维护与疏散安排的具体说明，并重新提交申请。</w:t>
             </w:r>
           </w:p>
         </w:tc>
@@ -4286,7 +4286,7 @@
           <w:color w:val="333E4C"/>
           <w:sz w:val="20"/>
         </w:rPr>
-        <w:t>三种模型异常的演示开关原本接在本地模式分支上，接入真实模型后点击没有反应；其中「虚构规则」还会报成结构错误，与演示口径不符。原因是故障注入与模型模式耦合，且注入方式对不同任务不一致。修复后故障与模型模式解耦，先真实调用再注入，超时改为收缩真实请求预算。复验即第 03 节的九种组合，全部符合预期。</w:t>
+        <w:t>三种模型异常的演示开关原本接在本地模式分支上，接入真实模型后点击没有反应；其中“虚构规则”还会报成结构错误，与演示口径不符。原因是故障注入与模型模式耦合，且注入方式对不同任务不一致。修复后故障与模型模式解耦，先真实调用再注入，超时改为收缩真实请求预算。复验即第 03 节的九种组合，全部符合预期。</w:t>
       </w:r>
     </w:p>
     <w:p>

</xml_diff>